<commit_message>
Resume: Cybersecurity Research Intern @ Unknown (unknown)
</commit_message>
<xml_diff>
--- a/resumes/Resume_Cybersecurity_Research_Intern_Unknown__unknown_.docx
+++ b/resumes/Resume_Cybersecurity_Research_Intern_Unknown__unknown_.docx
@@ -430,7 +430,7 @@
           <w:sz w:val="19"/>
           <w:szCs w:val="19"/>
         </w:rPr>
-        <w:t>Triaged 50+ weekly inventory reimbursement cases by severity and policy eligibility, translating high-volume case review into structured investigation, escalation, and evidence documentation.</w:t>
+        <w:t>Triaged 50+ weekly inventory cases by severity and policy, documenting evidence and escalating as needed.</w:t>
       </w:r>
     </w:p>
     <w:p>
@@ -468,7 +468,7 @@
           <w:sz w:val="19"/>
           <w:szCs w:val="19"/>
         </w:rPr>
-        <w:t>Maintained audit-ready case documentation with findings, decisions, evidence notes, and corrective actions aligned to evidence documentation and decision trails.</w:t>
+        <w:t>Maintained audit-ready case documentation with findings, evidence notes, and corrective actions aligned to evidence trails.</w:t>
       </w:r>
     </w:p>
     <w:p>
@@ -588,7 +588,7 @@
           <w:sz w:val="19"/>
           <w:szCs w:val="19"/>
         </w:rPr>
-        <w:t>Deployed Splunk SIEM with SPL correlation searches for brute-force detection, lateral movement, and privilege escalation; mapped TTPs to MITRE ATT&amp;CK and wrote PICERL incident report for FIRST.org.</w:t>
+        <w:t>Deployed Splunk SIEM with SPL correlation searches for brute-force detection, lateral movement, and privilege escalation; mapped TTPs to MITRE ATT&amp;CK and created FIRST.org incident report.</w:t>
       </w:r>
     </w:p>
     <w:p>
@@ -607,7 +607,7 @@
           <w:sz w:val="19"/>
           <w:szCs w:val="19"/>
         </w:rPr>
-        <w:t>Developed SOAR-style detection pipeline: Python script ingests Splunk alerts, enriches with VirusTotal API, and dispatches Telegram notifications with severity classification.</w:t>
+        <w:t>Built automated SOAR (security orchestration and automation)-style detection pipeline: Python script ingests Splunk alerts, runs IOC enrichment (threat intelligence) via VirusTotal API, and dispatches Telegram notifications with severity classification.</w:t>
       </w:r>
     </w:p>
     <w:p>
@@ -626,7 +626,7 @@
           <w:sz w:val="19"/>
           <w:szCs w:val="19"/>
         </w:rPr>
-        <w:t>Converted detection logic to Sigma rules (detection-as-code) for enterprise SOCs; analyzed TCP/IP traffic in Wireshark for SYN scans, DNS tunnelling, and plaintext credential exposure.</w:t>
+        <w:t>Converted detection logic to Sigma rules; analyzed TCP/IP traffic in Wireshark for SYN scans, DNS tunnelling, and plaintext credential exposure.</w:t>
       </w:r>
     </w:p>
     <w:p>
@@ -716,7 +716,7 @@
           <w:sz w:val="19"/>
           <w:szCs w:val="19"/>
         </w:rPr>
-        <w:t>Developed OWASP Top 10 automated web checker detecting injection, auth, and SSRF vulnerabilities, documenting SQL injection exploit and remediation.</w:t>
+        <w:t>Developed OWASP Top 10 automated web checker to detect injection, auth, and SSRF vulnerabilities, documenting SQL injection remediation.</w:t>
       </w:r>
     </w:p>
     <w:p>
@@ -735,7 +735,7 @@
           <w:sz w:val="19"/>
           <w:szCs w:val="19"/>
         </w:rPr>
-        <w:t>Automated scan scheduling via Bash and cron; built delta-scan logic to flag newly discovered CVEs and organize patch compliance (remediation tracking) tracking evidence.</w:t>
+        <w:t>Automated scan scheduling via Bash and cron; built delta-scan logic for CVE flagging and patch compliance tracking.</w:t>
       </w:r>
     </w:p>
     <w:p>

</xml_diff>